<commit_message>
Lock entity decision: Tyler Hospice Hold, LLC (Wyoming); standardize name
- Keep Wyoming (per decision); revert prior Texas edit on OA Amendment header
- Standardize entity name to 'Tyler Hospice Hold, LLC' across the package
  (52 refs: 'HoldCo L.L.C.' x16 and bare 'Hold LLC' x36)
- Add drafting note: A&R OA is a Wyoming LLC foreign-qualified in TX, and the
  Hickory MIPA (which names a Texas buyer) must be amended to the WY entity
- Add COUNSEL_QA_REVIEW capturing the locked six decisions + residuals

https://claude.ai/code/session_01GAHLyfqLR9bxwN2jm6VjPU
</commit_message>
<xml_diff>
--- a/sba_application/01_company_profile/Affiliate_and_Size_Standard_MEMO.docx
+++ b/sba_application/01_company_profile/Affiliate_and_Size_Standard_MEMO.docx
@@ -20,7 +20,7 @@
           <w:color w:val="606060"/>
           <w:sz w:val="18"/>
         </w:rPr>
-        <w:t>SBA 7(a) Application - Tyler Hospice HoldCo L.L.C. (dba Azalea Hospice &amp; Palliative Care)</w:t>
+        <w:t>SBA 7(a) Application - Tyler Hospice Hold, LLC (dba Azalea Hospice &amp; Palliative Care)</w:t>
       </w:r>
     </w:p>
     <w:p>
@@ -508,7 +508,7 @@
           <w:color w:val="606060"/>
           <w:sz w:val="16"/>
         </w:rPr>
-        <w:t>Prepared for the SBA 7(a) loan application of Tyler Hospice Hold LLC (dba Azalea Hospice &amp; Palliative Care). Confidential.</w:t>
+        <w:t>Prepared for the SBA 7(a) loan application of Tyler Hospice Hold, LLC (dba Azalea Hospice &amp; Palliative Care). Confidential.</w:t>
       </w:r>
     </w:p>
     <w:sectPr>

</xml_diff>